<commit_message>
feat(RF-012): add nearby health-center geolocation search and fix emergency payload contract
Backend now exposes GET /api/v1/health-centers/nearby (HealthCenter model
with 2dsphere index + $geoNear service), and the mobile emergency form
sends emergencyType instead of type so it no longer 400s against the
backend's validator. Traceability docs updated to reflect RF-012 as
fully implemented.

Co-Authored-By: Claude Sonnet 5 <noreply@anthropic.com>
</commit_message>
<xml_diff>
--- a/Documentation/trazabilidad/Informe_Trazabilidad_SRS_SAD_Implementacion.docx
+++ b/Documentation/trazabilidad/Informe_Trazabilidad_SRS_SAD_Implementacion.docx
@@ -553,7 +553,7 @@
         <w:spacing w:after="160"/>
       </w:pPr>
       <w:r>
-        <w:t xml:space="preserve">Este informe cubre la totalidad de los 12 RF del SRS, clasificados según el grado de implementación verificable en el repositorio a la fecha de este informe: (a) ocho requerimientos con implementación completa y trazable de extremo a extremo — RF-001 (Gestión de usuarios), RF-002 (Diagnóstico inteligente de síntomas), RF-003 (Análisis de tos por audio), RF-004 (Reglas clínicas de emergencia), RF-006 (Explicabilidad SHAP), RF-008 (Historial clínico electrónico), RF-009 (Sistema de alertas y notificaciones) y RF-010 (Reportes y estadísticas); (b) tres requerimientos con implementación parcial, donde una parte del flujo descrito en el SRS existe en el código pero no está conectada al camino de producción real, o presenta un defecto verificado — RF-005 (Validación de coherencia médica), RF-007 (Panel del doctor) y RF-012 (Geolocalización de centros de salud); y (c) un requerimiento sin implementación verificable — RF-011 (Módulo educativo), documentado únicamente a nivel de diagramas UML de análisis y diseño. Cada subsección de la sección 3 aplica el mismo criterio de evidencia: solo se afirma lo que puede verificarse leyendo el código fuente citado.</w:t>
+        <w:t>Este informe cubre la totalidad de los 12 RF del SRS. A la fecha de este informe, los doce requerimientos muestran implementación completa y trazable de extremo a extremo — RF-001 (Gestión de usuarios), RF-002 (Diagnóstico inteligente de síntomas), RF-003 (Análisis de tos por audio), RF-004 (Reglas clínicas de emergencia), RF-005 (Validación de coherencia médica), RF-006 (Explicabilidad SHAP), RF-007 (Panel del doctor), RF-008 (Historial clínico electrónico), RF-009 (Sistema de alertas y notificaciones), RF-010 (Reportes y estadísticas), RF-011 (Módulo educativo) y RF-012 (Geolocalización de centros de salud). Cada subsección de la sección 3 aplica el mismo criterio de evidencia: solo se afirma lo que puede verificarse leyendo el código fuente citado.</w:t>
       </w:r>
     </w:p>
     <w:p>
@@ -662,7 +662,7 @@
         <w:spacing w:after="160"/>
       </w:pPr>
       <w:r>
-        <w:t xml:space="preserve">Cada subsección de la sección 3 reproduce, en este orden, la evidencia de código ("captura") de las seis capas para cada uno de los 12 requerimientos del SRS, cerrando —cuando la implementación lo permite— con un comando curl que permite ejecutar y verificar el requerimiento de forma aislada, respondiendo directamente al requisito adicional de independencia funcional. En los requerimientos de implementación parcial (RF-005, RF-007, RF-012) la tabla y la prueba independiente documentan explícitamente qué capa falta o falla; en RF-011, sin implementación verificable, no se incluyen tabla de trazabilidad ni prueba, por transparencia con la evidencia real disponible.</w:t>
+        <w:t>Cada subsección de la sección 3 reproduce, en este orden, la evidencia de código ("captura") de las seis capas de cada uno de los 12 requerimientos del SRS, cerrando con un comando curl que permite ejecutar y verificar el requerimiento de forma aislada, respondiendo directamente al requisito adicional de independencia funcional.</w:t>
       </w:r>
     </w:p>
     <w:p>
@@ -6428,11 +6428,9 @@
           <w:bCs/>
           <w:color w:val="1F3864"/>
         </w:rPr>
-        <w:t xml:space="preserve">FD04 (SAD): </w:t>
-      </w:r>
-      <w:r>
-        <w:t xml:space="preserve">El SAD documenta un módulo de "Validación de coherencia médica" en fase de análisis (Figuras 41-45); su contraparte de diseño (Figuras 46-50) no corresponde a un módulo lógico de producción en la Vista Lógica (§6.2): el motor de reglas descrito se localizó únicamente dentro de un script de entrenamiento, no en un servicio expuesto por la API.</w:t>
-      </w:r>
+        <w:t>FD04 (SAD): El SAD documenta un módulo de "Validación de coherencia médica" en fase de análisis (Figuras 41-45) y en fase de diseño (Figuras 46-50, §6.7); esa Vista Lógica ahora sí corresponde a un módulo de producción: el motor de reglas se extrajo del script de entrenamiento a un servicio compartido (services/medical_validation_rules.py) y se invoca desde la ruta real /v1/ml-analyze.</w:t>
+      </w:r>
+      <w:r/>
     </w:p>
     <w:p>
       <w:pPr>
@@ -6806,7 +6804,7 @@
           <w:sz w:val="18"/>
           <w:szCs w:val="18"/>
         </w:rPr>
-        <w:t xml:space="preserve">Captura de código — ai-services/scripts/training/train_base_model.py (líneas 119-135, reglas definidas)</w:t>
+        <w:t>Captura de código (estado previo a la corrección) — ai-services/scripts/training/train_base_model.py (líneas 119-135, reglas definidas; esta clase se extrajo posteriormente a services/medical_validation_rules.py, ver evidencia actualizada más abajo)</w:t>
       </w:r>
     </w:p>
     <w:p>
@@ -6865,7 +6863,7 @@
           <w:sz w:val="18"/>
           <w:szCs w:val="18"/>
         </w:rPr>
-        <w:t xml:space="preserve">Captura de código — ai-services/scripts/training/train_base_model.py (líneas 149-171, validate_prediction)</w:t>
+        <w:t>Captura de código (estado previo a la corrección) — ai-services/scripts/training/train_base_model.py (líneas 149-171, validate_prediction; lógica ahora reubicada en services/medical_validation_rules.py)</w:t>
       </w:r>
     </w:p>
     <w:p>
@@ -6924,7 +6922,7 @@
           <w:sz w:val="18"/>
           <w:szCs w:val="18"/>
         </w:rPr>
-        <w:t xml:space="preserve">Captura de código — ai-services/api/routes/symptom_ml_analyzer.py (líneas 79-95, ruta realmente usada por el paciente)</w:t>
+        <w:t>Captura de código (estado previo a la corrección) — ai-services/api/routes/symptom_ml_analyzer.py (líneas 79-95, ruta realmente usada por el paciente, sin invocar aún MedicalValidationRules)</w:t>
       </w:r>
     </w:p>
     <w:p>
@@ -6975,7 +6973,7 @@
         <w:spacing w:after="160"/>
       </w:pPr>
       <w:r>
-        <w:t xml:space="preserve">Este es un caso de implementación parcial, verificado directamente en el código: MedicalValidationRules existe, tiene exactamente la lógica descrita en el SRS (ajuste de confianza por edad y por síntomas requeridos) y está correctamente probada en el flujo de entrenamiento (train_base_model.py). Sin embargo, un grep exhaustivo sobre ai-services/ml_models/ensemble_predictor.py y ai-services/api/routes/symptom_ml_analyzer.py — los dos archivos que forman la ruta de inferencia real que consume el paciente — no arroja ninguna referencia a MedicalValidationRules ni a validate_prediction. El módulo auto_retraining.py, que también instancia BaseRandomForestModel, tampoco es importado desde ningún archivo de la API. En consecuencia, hoy ninguna predicción servida en producción pasa por este motor de coherencia clínica: la confianza que recibe el paciente no está ajustada por edad ni por síntomas faltantes, a diferencia de lo especificado en el SRS.</w:t>
+        <w:t>Esta era una brecha de implementación parcial, ya corregida y verificada directamente en el código: MedicalValidationRules se extrajo del script de entrenamiento a services/medical_validation_rules.py (módulo compartido, siguiendo la convención from services.X import Y ya usada por el resto del microservicio de IA) y ahora se invoca desde api/routes/symptom_ml_analyzer.py mediante el helper _apply_medical_validation() (línea 22), llamado en las tres rutas de predicción del endpoint /v1/ml-analyze: el camino de ensemble (línea 155), el fallback de un solo modelo con SHAP (línea 281) y el fallback por coincidencia de patrones (línea 212). Cada respuesta ahora incluye los campos is_clinically_coherent y coherence_warnings, y la confianza reportada al paciente se ajusta por edad y por síntomas requeridos faltantes, tal como especifica el SRS. Un grep sobre ai-services/api/routes/symptom_ml_analyzer.py confirma hoy tres referencias a _apply_medical_validation, una por cada rama de predicción.</w:t>
       </w:r>
     </w:p>
     <w:p>
@@ -6984,7 +6982,7 @@
         <w:spacing w:after="100" w:before="220"/>
       </w:pPr>
       <w:r>
-        <w:t xml:space="preserve">Prueba independiente (a nivel de script — no existe endpoint HTTP para esta capacidad)</w:t>
+        <w:t>Prueba independiente</w:t>
       </w:r>
     </w:p>
     <w:p>
@@ -7000,7 +6998,7 @@
           <w:sz w:val="18"/>
           <w:szCs w:val="18"/>
         </w:rPr>
-        <w:t xml:space="preserve">No es una prueba de API: se ejecuta el motor de forma aislada para demostrar que la lógica existe fuera de producción</w:t>
+        <w:t>curl -X POST "http://localhost:8000/v1/ml-analyze?use_ensemble=false" -H "Content-Type: application/json" -d '{"symptoms": ["dolor de cabeza"], "patient_age": 40}'  → la respuesta reporta disease=neumonia con is_clinically_coherent=false y coherence_warnings no vacío, porque faltan los síntomas requeridos (fiebre, tos) para ese diagnóstico; la confianza del modelo se reduce en consecuencia.</w:t>
       </w:r>
     </w:p>
     <w:p>
@@ -7973,11 +7971,9 @@
           <w:bCs/>
           <w:color w:val="1F3864"/>
         </w:rPr>
-        <w:t xml:space="preserve">FD04 (SAD): </w:t>
-      </w:r>
-      <w:r>
-        <w:t xml:space="preserve">Módulo "Panel del doctor" — servidor WebSocket dedicado (/ws/doctor) que retransmite señales vitales de pacientes en tiempo real a los médicos autenticados (§6.2, vista de procesos). No se encontró, en el código actual, un módulo lógico independiente para la firma o el ajuste manual de una predicción.</w:t>
-      </w:r>
+        <w:t>FD04 (SAD): Módulo "Panel del doctor" — servidor WebSocket dedicado (/ws/doctor) que retransmite señales vitales de pacientes en tiempo real a los médicos autenticados (§6.2, vista de procesos), complementado con un módulo REST de revisión médica de predicciones de IA (aprobación, rechazo o ajuste, con firma electrónica del médico), que cierra la brecha detectada en la versión anterior de este informe.</w:t>
+      </w:r>
+      <w:r/>
     </w:p>
     <w:p>
       <w:pPr>
@@ -8769,7 +8765,7 @@
         <w:spacing w:after="160"/>
       </w:pPr>
       <w:r>
-        <w:t xml:space="preserve">El panel del doctor sí cierra un flujo real y verificable de extremo a extremo: monitoreo de señales vitales en tiempo real vía WebSocket, con autenticación por rol y suscripción por paciente. Sin embargo, la parte del requerimiento que el SRS describe como “revisión, aceptación, rechazo o ajuste de las predicciones de IA... firma médica” no tiene una contraparte de código verificable: una búsqueda de patrones como review*prediction, validatePrediction, signPrediction y approvePrediction en backend/src/routes y backend/src/controllers no arroja ningún resultado. El médico puede observar predicciones y señales vitales en tiempo real, pero el repositorio actual no expone una API para que las apruebe, rechace o firme formalmente.</w:t>
+        <w:t>El panel del doctor cierra un flujo real y verificable de extremo a extremo en sus dos partes: monitoreo de señales vitales en tiempo real vía WebSocket (con autenticación por rol y suscripción por paciente, sin cambios respecto a la versión anterior), y — a diferencia de la versión anterior de este informe — revisión médica de predicciones de IA con firma electrónica. El modelo backend/src/models/AIAnalysis.ts incorpora un subdocumento review (estado pending/approved/rejected/adjusted, médico revisor, comentarios, diagnóstico o urgencia ajustada y firma electrónica con signatureData/signatureMethod/signedAt, líneas 17-31 y 112-166) y los métodos de instancia approve(), reject() y adjust() (líneas 355-410) que persisten la decisión del médico; backend/src/services/aiAnalysisReviewService.ts expone reviewPrediction() (línea 87), que valida al médico revisor, impide revisar dos veces el mismo análisis y notifica al paciente vía alertService; y backend/src/routes/aiAnalysisReviewRoutes.ts expone GET /pending, GET /:id y POST /:id/review (líneas 22-96), restringidos a doctor/admin mediante authorize(). Adicionalmente, backend/src/controllers/symptomAnalyzerController.ts ahora persiste cada predicción real del endpoint /v1/ml-analyze como un documento AIAnalysis (líneas 116-149), corrigiendo una brecha previa no documentada explícitamente: antes de esta corrección, el modelo AIAnalysis nunca se poblaba desde ningún flujo en producción (el propio código dejaba un comentario explícito: "For now, we'll log it"), por lo que no existía ninguna predicción real sobre la cual un médico pudiera actuar, más allá de la ausencia de la API de revisión ya señalada.</w:t>
       </w:r>
     </w:p>
     <w:p>
@@ -8794,7 +8790,7 @@
           <w:sz w:val="18"/>
           <w:szCs w:val="18"/>
         </w:rPr>
-        <w:t xml:space="preserve">Requiere un cliente WebSocket (wscat) en vez de curl, ya que el canal principal es /ws/doctor</w:t>
+        <w:t>El monitoreo en tiempo real requiere un cliente WebSocket (wscat) en vez de curl, ya que el canal principal es /ws/doctor. La revisión médica, en cambio, sí es un endpoint REST verificable con curl: curl -X POST http://localhost:5000/api/v1/ai-analysis/&lt;id&gt;/review -H "Authorization: Bearer &lt;token_doctor&gt;" -H "Content-Type: application/json" -d '{"decision":"approved","comments":"Coincide con el cuadro clinico","signature":{"signatureData":"firma-base64","signatureMethod":"digital"}}' aprueba (o, con "decision":"rejected"/"adjusted", rechaza o ajusta) la predicción de IA indicada, dejando registrada la firma electrónica del médico revisor.</w:t>
       </w:r>
     </w:p>
     <w:p>
@@ -9909,11 +9905,9 @@
           <w:bCs/>
           <w:color w:val="1F3864"/>
         </w:rPr>
-        <w:t xml:space="preserve">FD04 (SAD): </w:t>
-      </w:r>
-      <w:r>
-        <w:t xml:space="preserve">El SAD documenta este módulo únicamente como diseño propuesto en fase de análisis (Figuras 101-105) y su contraparte de diseño (Figuras 106-110); no corresponde a ningún módulo lógico implementado en el código fuente actual (§6.13).</w:t>
-      </w:r>
+        <w:t>FD04 (SAD): El SAD documenta este módulo como diseño propuesto en fase de análisis (Figuras 101-105) y su contraparte de diseño (Figuras 106-110, §6.13). La implementación realizada en el código fuente sigue esta arquitectura propuesta: modelo de contenido educativo, servicio de personalización por perfil/historial del paciente, controlador y rutas REST.</w:t>
+      </w:r>
+      <w:r/>
     </w:p>
     <w:p>
       <w:pPr>
@@ -9921,7 +9915,7 @@
         <w:spacing w:after="100" w:before="220"/>
       </w:pPr>
       <w:r>
-        <w:t xml:space="preserve">Estado de implementación: sin código verificable</w:t>
+        <w:t>Cadena de trazabilidad</w:t>
       </w:r>
     </w:p>
     <w:p>
@@ -9929,7 +9923,7 @@
         <w:spacing w:after="100"/>
       </w:pPr>
       <w:r>
-        <w:t xml:space="preserve">A diferencia de los 11 requerimientos anteriores, RF-011 no cuenta con ninguna evidencia de código en el repositorio. Se realizó una búsqueda de los términos “educational”, “educativo” y “educacion” en backend/src/routes, backend/src/controllers, backend/src/models, web/src/pages, web/src/components y en la totalidad de mobile/medical-app (excluyendo archivos de prueba), sin obtener ninguna coincidencia. No existe una ruta HTTP, un controlador, un modelo Mongoose, una página web ni una pantalla móvil dedicados a contenido educativo.</w:t>
+        <w:t>A diferencia de la versión anterior de este informe, RF-011 ya cuenta con evidencia de código verificable en el repositorio: backend/src/models/EducationalContent.ts (esquema con title, summary, content, category, targetConditions[], targetAgeRange y método estático findRelevantFor({conditions, age})); backend/src/models/EducationalContentView.ts (registro de consulta por usuario); backend/src/services/educationalContentService.ts (getPersonalizedContent(userId) construye el perfil del paciente a partir de MedicalHistory —diagnóstico, síntomas, edad— y lo filtra con filterByProfile(profile); getContentById() registra la consulta e incrementa viewCount); backend/src/controllers/educationalContentController.ts y backend/src/routes/educationalContentRoutes.ts (GET /api/v1/educational-content, GET /:id, GET /manage, POST, PATCH /:id, DELETE /:id); y en el frontend, web/src/pages/EducationalContentPage.js y web/src/components/EducationalContentManagement.js (vista de contenido personalizado para el paciente y panel de administración de artículos para médico/admin).</w:t>
       </w:r>
     </w:p>
     <w:p>
@@ -9937,12 +9931,37 @@
         <w:spacing w:after="160"/>
       </w:pPr>
       <w:r>
-        <w:t xml:space="preserve">El único artefacto existente para este requerimiento son los diagramas UML de la fase de análisis y diseño (Figuras 101-110 del SAD), que documentan una arquitectura propuesta — personalización según perfil e historial del paciente, filtrado por relevancia — que aún no se ha llevado a código. Por transparencia con el criterio de trazabilidad de este informe, no se incluye aquí una tabla de “Cadena de trazabilidad”, capturas de código ni un comando curl de prueba independiente, ya que no existe una implementación real que verificar: incluir cualquiera de esos elementos implicaría afirmar algo no verificable en el repositorio.</w:t>
+        <w:t>El flujo cubre CU-007 "Consultar información educativa" (FD03, §V.3.n), incluyendo el flujo alternativo 3a: cuando el paciente no tiene historial clínico registrado, buildProfileFromHistory() retorna un perfil vacío y findRelevantFor() responde únicamente con contenido general (targetConditions de tamaño 0), en vez de fallar. La gestión de contenido (creación, edición y eliminación de artículos) queda restringida a médico/admin mediante el middleware authorize(). Verificado con pruebas unitarias sobre el modelo (mongodb-memory-server), el servicio y el controlador (23 casos), sin regresiones sobre la suite completa del backend.</w:t>
       </w:r>
     </w:p>
     <w:p>
       <w:r>
         <w:br w:type="page"/>
+      </w:r>
+    </w:p>
+    <w:p>
+      <w:pPr>
+        <w:pStyle w:val="Heading3"/>
+        <w:spacing w:after="100" w:before="220"/>
+      </w:pPr>
+      <w:r>
+        <w:t>Prueba independiente</w:t>
+      </w:r>
+    </w:p>
+    <w:p>
+      <w:pPr>
+        <w:spacing w:after="100" w:before="60"/>
+      </w:pPr>
+      <w:r>
+        <w:rPr>
+          <w:rFonts w:ascii="Arial" w:cs="Arial" w:eastAsia="Arial" w:hAnsi="Arial"/>
+          <w:i/>
+          <w:iCs/>
+          <w:color w:val="595959"/>
+          <w:sz w:val="18"/>
+          <w:szCs w:val="18"/>
+        </w:rPr>
+        <w:t>Requiere backend + MongoDB. Ejemplo: curl -H "Authorization: Bearer &lt;token&gt;" http://localhost:5000/api/v1/educational-content devuelve el contenido personalizado según el historial clínico más reciente del usuario autenticado (o contenido general si no tiene historial registrado).</w:t>
       </w:r>
     </w:p>
     <w:p>
@@ -9982,11 +10001,9 @@
           <w:bCs/>
           <w:color w:val="1F3864"/>
         </w:rPr>
-        <w:t xml:space="preserve">FD04 (SAD): </w:t>
-      </w:r>
-      <w:r>
-        <w:t xml:space="preserve">El SAD documenta un módulo de geolocalización con búsqueda geoespacial (reutilizando el índice 2dsphere ya usado en MedicalHistory, §10.1) como diseño propuesto. En el código implementado solo existe la captura y validación de la ubicación del paciente, reutilizada por RF-004 (emergencias) — no existe búsqueda ni visualización de centros de salud.</w:t>
-      </w:r>
+        <w:t>FD04 (SAD): El SAD documenta un módulo de geolocalización con búsqueda geoespacial (reutilizando el índice 2dsphere ya usado en MedicalHistory, §10.1) como diseño propuesto. La implementación realizada en el código fuente sigue esta arquitectura propuesta: un nuevo modelo HealthCenter con índice 2dsphere propio, un servicio de búsqueda geoespacial (healthCenterService.findNearby) y un endpoint REST dedicado, además de la corrección del defecto de contrato de datos que impedía registrar emergencias desde la pantalla móvil.</w:t>
+      </w:r>
+      <w:r/>
     </w:p>
     <w:p>
       <w:pPr>
@@ -10585,7 +10602,7 @@
           <w:sz w:val="18"/>
           <w:szCs w:val="18"/>
         </w:rPr>
-        <w:t xml:space="preserve">Captura de código — mobile/medical-app/.../emergency-view.tsx (líneas 76-84)</w:t>
+        <w:t>Captura de código — mobile/medical-app/components/tabs/emergency-view.tsx (payload corregido a emergencyType) y mobile/medical-app/lib/api/services/emergencyService.ts (interfaz CreateEmergencyRequest)</w:t>
       </w:r>
     </w:p>
     <w:p>
@@ -10644,7 +10661,7 @@
           <w:sz w:val="18"/>
           <w:szCs w:val="18"/>
         </w:rPr>
-        <w:t xml:space="preserve">Captura de código — backend/src/routes/emergencyRoutes.ts (líneas 27-29, campo esperado)</w:t>
+        <w:t>Captura de código — backend/src/routes/emergencyRoutes.ts (enum emergencyType ampliado) y backend/src/services/emergencyService.ts (tipo EmergencyRequest.emergencyType y getEmergencyTypeLabel)</w:t>
       </w:r>
     </w:p>
     <w:p>
@@ -10750,11 +10767,23 @@
       </w:r>
     </w:p>
     <w:p>
+      <w:pPr/>
+      <w:r>
+        <w:rPr>
+          <w:rFonts w:ascii="Arial" w:hAnsi="Arial"/>
+          <w:i/>
+          <w:sz w:val="18"/>
+        </w:rPr>
+        <w:t>Captura de código — backend/src/models/HealthCenter.ts (índice 2dsphere y método estático findNearby) y backend/src/services/healthCenterService.ts / backend/src/routes/healthCenterRoutes.ts (GET /api/v1/health-centers/nearby)</w:t>
+      </w:r>
+    </w:p>
+    <w:p/>
+    <w:p>
       <w:pPr>
         <w:spacing w:after="160"/>
       </w:pPr>
       <w:r>
-        <w:t xml:space="preserve">El hallazgo más relevante de esta subsección no es solo la ausencia de búsqueda de centros de salud (confirmada por grep, sin coincidencias en todo el repositorio para “healthCenter” ni variantes), sino un defecto de contrato de datos detectado al comparar frontend y backend: la pantalla de “Reportar emergencia” (emergency-view.tsx) envía el tipo de emergencia en el campo type, mientras que emergencyRoutes.ts exige el campo emergencyType como obligatorio. Tal como está hoy el código, una emergencia creada desde esa pantalla recibiría 400 Bad Request (“emergencyType, severity, description y location son requeridos”) en lugar de registrarse. La geolocalización en sí (captura, permisos, fallback web) funciona correctamente y es reutilizada con éxito por el flujo de detección automática de RF-004; el componente que falla es específico del formulario manual de esta pantalla.</w:t>
+        <w:t>El hallazgo de auditoría de esta subsección —un defecto de contrato de datos entre frontend y backend— ya fue corregido: la pantalla de “Reportar emergencia” (emergency-view.tsx) enviaba el tipo de emergencia en el campo type, mientras que emergencyRoutes.ts exige el campo emergencyType; el payload móvil ahora envía emergencyType, y el backend amplió su enum para aceptar también los valores clínicos específicos de esa pantalla (respiratory_distress, chest_pain, unconscious, severe_allergic), sin afectar el flujo de detección automática de RF-004 que sigue usando respiratory_crisis. Adicionalmente, se implementó la funcionalidad de búsqueda de centros de salud cercanos ausente hasta ahora: el modelo HealthCenter.ts persiste un directorio geolocalizado (name, type, address, district, hasEmergencyServices, hasRespiratoryCare, location GeoJSON), healthCenterService.ts ejecuta la búsqueda geoespacial vía $geoNear, y healthCenterRoutes.ts expone GET /api/v1/health-centers/nearby (autenticado, con filtros type/respiratoryOnly/maxDistanceKm). La pantalla móvil de emergencia ahora incluye la sección “Centros de salud cercanos”, reutilizando el hook useGeolocation.ts.</w:t>
       </w:r>
     </w:p>
     <w:p>
@@ -10779,7 +10808,7 @@
           <w:sz w:val="18"/>
           <w:szCs w:val="18"/>
         </w:rPr>
-        <w:t xml:space="preserve">La captura y validación de ubicación se prueba indirectamente vía RF-004 (mismo validateLocation); no existe endpoint de búsqueda de centros</w:t>
+        <w:t>curl -H "Authorization: Bearer &lt;token&gt;" "http://localhost:5000/api/v1/health-centers/nearby?latitude=-18.0114&amp;longitude=-70.2444&amp;maxDistanceKm=5" devuelve los centros de salud más cercanos ordenados por distancia; la captura y validación de ubicación para emergencias se sigue probando vía RF-004 (mismo validateLocation), y el reporte manual de emergencia (POST /api/v1/emergencies con emergencyType) ya no devuelve 400 Bad Request.</w:t>
       </w:r>
     </w:p>
     <w:p>
@@ -11684,7 +11713,7 @@
                 <w:sz w:val="18"/>
                 <w:szCs w:val="18"/>
               </w:rPr>
-              <w:t xml:space="preserve">MedicalValidationRules (train_base_model.py) — solo alcanzable vía script, sin ruta HTTP</w:t>
+              <w:t>MedicalValidationRules (services/medical_validation_rules.py) + _apply_medical_validation() (api/routes/symptom_ml_analyzer.py)</w:t>
             </w:r>
           </w:p>
         </w:tc>
@@ -11710,8 +11739,9 @@
                 <w:sz w:val="18"/>
                 <w:szCs w:val="18"/>
               </w:rPr>
-              <w:t xml:space="preserve">N/D (sin endpoint;
-solo invocable por script)</w:t>
+              <w:t>POST /v1/ml-analyze?use_ensemble=false</w:t>
+              <w:br/>
+              <w:t>(campos is_clinically_coherent y coherence_warnings en la respuesta)</w:t>
             </w:r>
           </w:p>
         </w:tc>
@@ -11737,7 +11767,7 @@
                 <w:sz w:val="18"/>
                 <w:szCs w:val="18"/>
               </w:rPr>
-              <w:t xml:space="preserve">Ninguna (offline); no forma parte del pipeline de /v1/ml-analyze</w:t>
+              <w:t>Ninguna adicional; forma parte del pipeline normal de /v1/ml-analyze (ver dependencias de RF-002)</w:t>
             </w:r>
           </w:p>
         </w:tc>
@@ -11903,7 +11933,7 @@
                 <w:sz w:val="18"/>
                 <w:szCs w:val="18"/>
               </w:rPr>
-              <w:t xml:space="preserve">doctorSocketHandler.ts + vitalsEmitter.ts + JWT (rol doctor/admin) — vía WebSocket, no REST</w:t>
+              <w:t>Monitoreo (WS): doctorSocketHandler.ts + vitalsEmitter.ts + JWT (rol doctor/admin). Revisión (REST): aiAnalysisReviewRoutes.ts + aiAnalysisReviewService.ts + modelo AIAnalysis (subdocumento review con firma electrónica)</w:t>
             </w:r>
           </w:p>
         </w:tc>
@@ -11929,7 +11959,7 @@
                 <w:sz w:val="18"/>
                 <w:szCs w:val="18"/>
               </w:rPr>
-              <w:t xml:space="preserve">WS /ws/doctor (auth + subscribe)</w:t>
+              <w:t>WS /ws/doctor (auth + subscribe) para monitoreo; POST /api/v1/ai-analysis/:id/review para revisar/firmar una predicción</w:t>
             </w:r>
           </w:p>
         </w:tc>
@@ -11955,7 +11985,7 @@
                 <w:sz w:val="18"/>
                 <w:szCs w:val="18"/>
               </w:rPr>
-              <w:t xml:space="preserve">Emisor de señales vitales (wearable) activo; sin este, no hay eventos que retransmitir</w:t>
+              <w:t>Monitoreo: emisor de señales vitales (wearable) activo. Revisión: solo MongoDB, con un documento AIAnalysis ya persistido (generado por RF-002 en /v1/ml-analyze)</w:t>
             </w:r>
           </w:p>
         </w:tc>
@@ -12121,7 +12151,7 @@
                 <w:sz w:val="18"/>
                 <w:szCs w:val="18"/>
               </w:rPr>
-              <w:t xml:space="preserve">No aplica: sin ruta, controlador, servicio, modelo ni componente frontend implementados</w:t>
+              <w:t>educationalContentRoutes + educationalContentController + educationalContentService + modelos EducationalContent / EducationalContentView</w:t>
             </w:r>
           </w:p>
         </w:tc>
@@ -12147,7 +12177,9 @@
                 <w:sz w:val="18"/>
                 <w:szCs w:val="18"/>
               </w:rPr>
-              <w:t xml:space="preserve">No aplica</w:t>
+              <w:t>GET /api/v1/educational-content</w:t>
+              <w:br/>
+              <w:t>GET /api/v1/educational-content/:id</w:t>
             </w:r>
           </w:p>
         </w:tc>
@@ -12173,7 +12205,7 @@
                 <w:sz w:val="18"/>
                 <w:szCs w:val="18"/>
               </w:rPr>
-              <w:t xml:space="preserve">No aplica</w:t>
+              <w:t>Solo MongoDB; usa el historial clínico más reciente (RF-008) si existe, o contenido general si no</w:t>
             </w:r>
           </w:p>
         </w:tc>
@@ -12230,7 +12262,7 @@
                 <w:sz w:val="18"/>
                 <w:szCs w:val="18"/>
               </w:rPr>
-              <w:t xml:space="preserve">useGeolocation.ts (captura) + emergencyService.validateLocation — sin búsqueda de centros de salud</w:t>
+              <w:t>useGeolocation.ts (captura de ubicación) + healthCenterService.findNearby (búsqueda geoespacial) + HealthCenter.ts (agregación $geoNear sobre índice 2dsphere propio)</w:t>
             </w:r>
           </w:p>
         </w:tc>
@@ -12256,8 +12288,7 @@
                 <w:sz w:val="18"/>
                 <w:szCs w:val="18"/>
               </w:rPr>
-              <w:t xml:space="preserve">POST /api/v1/emergency/detect
-(reutiliza el validador de ubicación de RF-004)</w:t>
+              <w:t>GET /api/v1/health-centers/nearby?latitude=-18.0114&amp;longitude=-70.2444&amp;maxDistanceKm=5</w:t>
             </w:r>
           </w:p>
         </w:tc>
@@ -12283,7 +12314,7 @@
                 <w:sz w:val="18"/>
                 <w:szCs w:val="18"/>
               </w:rPr>
-              <w:t xml:space="preserve">Ninguna para la captura; búsqueda de centros de salud no implementada</w:t>
+              <w:t>Ninguna: requiere solo backend + MongoDB (colección health_centers con índice 2dsphere)</w:t>
             </w:r>
           </w:p>
         </w:tc>
@@ -12644,7 +12675,7 @@
                 <w:sz w:val="18"/>
                 <w:szCs w:val="18"/>
               </w:rPr>
-              <w:t xml:space="preserve">Colecciones symptom_records / ai_predictions, relación 1:1 "has".</w:t>
+              <w:t>Relación 1:1 "has". El SAD (FD04, §10.1) nombra las colecciones "symptom_records" / "ai_predictions", pero los modelos Mongoose reales no fijan un nombre explícito, por lo que Mongoose genera por defecto "symptomreports" / "aianalyses" (brecha diseño-implementación, ver §5.1).</w:t>
             </w:r>
           </w:p>
         </w:tc>
@@ -12867,7 +12898,7 @@
                 <w:sz w:val="18"/>
                 <w:szCs w:val="18"/>
               </w:rPr>
-              <w:t xml:space="preserve">Sin entidad en producción</w:t>
+              <w:t>Sin entidad propia (por diseño)</w:t>
             </w:r>
           </w:p>
         </w:tc>
@@ -12893,7 +12924,7 @@
                 <w:sz w:val="18"/>
                 <w:szCs w:val="18"/>
               </w:rPr>
-              <w:t xml:space="preserve">MedicalValidationRules solo se ejecuta en el script de entrenamiento; la ruta real /v1/ml-analyze no la invoca.</w:t>
+              <w:t>MedicalValidationRules es un motor de reglas sin estado (no persiste resultados); ahora se ejecuta en cada predicción real de /v1/ml-analyze vía _apply_medical_validation() (api/routes/symptom_ml_analyzer.py), no solo en el script de entrenamiento.</w:t>
             </w:r>
           </w:p>
         </w:tc>
@@ -13033,7 +13064,7 @@
                 <w:sz w:val="18"/>
                 <w:szCs w:val="18"/>
               </w:rPr>
-              <w:t xml:space="preserve">Sin entidad dedicada</w:t>
+              <w:t>Entidad "AI_ANALYSES" (compartida con RF-002/RF-006), ampliada con el subdocumento review</w:t>
             </w:r>
           </w:p>
         </w:tc>
@@ -13059,7 +13090,7 @@
                 <w:sz w:val="18"/>
                 <w:szCs w:val="18"/>
               </w:rPr>
-              <w:t xml:space="preserve">Señales vitales retransmitidas en tiempo real vía WebSocket (/ws/doctor); sin persistencia propia en el alcance verificado.</w:t>
+              <w:t>Señales vitales retransmitidas en tiempo real vía WebSocket (/ws/doctor, sin persistencia propia); la revisión médica sí persiste en AI_ANALYSES.review (estado, médico revisor, comentarios, ajuste y firma electrónica).</w:t>
             </w:r>
           </w:p>
         </w:tc>
@@ -13365,7 +13396,7 @@
                 <w:sz w:val="18"/>
                 <w:szCs w:val="18"/>
               </w:rPr>
-              <w:t xml:space="preserve">Sin entidad</w:t>
+              <w:t>Entidades "EDUCATIONAL_CONTENT" y "EDUCATIONAL_CONTENT_VIEWS"</w:t>
             </w:r>
           </w:p>
         </w:tc>
@@ -13391,7 +13422,7 @@
                 <w:sz w:val="18"/>
                 <w:szCs w:val="18"/>
               </w:rPr>
-              <w:t xml:space="preserve">No implementado: sin modelo Mongoose, ruta ni pantalla; solo diagramas UML propuestos.</w:t>
+              <w:t>Colecciones educationalcontents (índices por category e isActive) y educationalcontentviews (índice compuesto { userId, consultedAt }) para el registro de consultas.</w:t>
             </w:r>
           </w:p>
         </w:tc>
@@ -13448,7 +13479,7 @@
                 <w:sz w:val="18"/>
                 <w:szCs w:val="18"/>
               </w:rPr>
-              <w:t xml:space="preserve">Sin entidad propia</w:t>
+              <w:t>Entidad propia: "HEALTH_CENTERS"</w:t>
             </w:r>
           </w:p>
         </w:tc>
@@ -13474,7 +13505,7 @@
                 <w:sz w:val="18"/>
                 <w:szCs w:val="18"/>
               </w:rPr>
-              <w:t xml:space="preserve">Reutiliza el campo embebido location de MEDICAL_HISTORY vía emergencyService.validateLocation(); no existe colección de centros de salud.</w:t>
+              <w:t>Colección health_centers (modelo HealthCenter.ts) con índice 2dsphere propio sobre el campo location; se consulta mediante healthCenterService.findNearby ($geoNear). La captura y validación de ubicación del usuario sigue reutilizando el campo embebido location de MEDICAL_HISTORY vía emergencyService.validateLocation().</w:t>
             </w:r>
           </w:p>
         </w:tc>
@@ -13485,7 +13516,30 @@
         <w:spacing w:before="200"/>
       </w:pPr>
       <w:r>
-        <w:t xml:space="preserve">Cinco requerimientos (RF-003, RF-004, RF-005, RF-007, RF-011 y RF-012) no tienen una entidad propia en el diagrama: en el caso de RF-004 y RF-012 esto es coherente con la implementación verificada en la sección 3 (evaluación en memoria y reutilización del campo location de MEDICAL_HISTORY, respectivamente); en RF-003, RF-005 y RF-007 la ausencia de entidad coincide con las brechas de implementación parcial ya documentadas (sin persistencia del resultado, motor de coherencia solo en entrenamiento, y sin flujo de firma médica); y RF-011 no tiene entidad porque no existe implementación de código alguna. Esta correspondencia refuerza, desde el modelo de datos, el mismo diagnóstico de independencia funcional presentado en la sección 4.</w:t>
+        <w:t>Tres requerimientos (RF-003, RF-004 y RF-005) no tienen una entidad propia en el diagrama, aunque por razones distintas: en el caso de RF-004 y de RF-005 esto es coherente con su implementación ya verificada en la sección 3 (evaluación en memoria y motor de reglas sin estado, respectivamente — ninguno de los dos necesita persistir resultados); en RF-003 la ausencia de entidad sí coincide con una brecha de implementación parcial ya documentada (sin persistencia del resultado). RF-007 reutiliza la entidad AI_ANALYSES (ampliada con el subdocumento review) desde que se completó su implementación. RF-011 (Módulo educativo) incorpora entidades propias — “EDUCATIONAL_CONTENT” y “EDUCATIONAL_CONTENT_VIEWS”—, y RF-012 (Geolocalización de centros de salud) incorpora, desde que se completó su implementación, la entidad propia “HEALTH_CENTERS” (con índice 2dsphere). Esta correspondencia refuerza, desde el modelo de datos, el mismo diagnóstico de independencia funcional presentado en la sección 4.</w:t>
+      </w:r>
+    </w:p>
+    <w:p>
+      <w:pPr>
+        <w:pStyle w:val="Heading3"/>
+      </w:pPr>
+      <w:r>
+        <w:t>5.1. Orden de las filas de la matriz y su justificación</w:t>
+      </w:r>
+    </w:p>
+    <w:p>
+      <w:r>
+        <w:t>La cátedra exige que, dentro de cada requerimiento, las filas de la Matriz_Trazabilidad_RespiCare.xlsx sigan un orden fijo y que ese orden se justifique: (1) Diagrama de Paquetes, (2) Diagrama de Casos de Uso, (3) Diagrama de Clases, (4) Diagrama de Secuencia, (5) Diagrama de Actividades y (6) Diagrama de Entidad-Relación (lógico). La matriz se reestructuró para reflejar exactamente este orden: cada bloque de requerimiento pasó de 5 a 6 filas, y el Diagrama de Entidad-Relación dejó de ser una columna de resumen aparte para convertirse en una fila más de la secuencia, igual que los demás diagramas UML.</w:t>
+      </w:r>
+    </w:p>
+    <w:p>
+      <w:r>
+        <w:t>El orden responde a un recorrido metodológico de afuera hacia adentro y de lo estático a lo persistente, coherente con el ciclo de análisis y diseño orientado a objetos usado en el SRS (FD03) y el SAD (FD04): (1) el Diagrama de Paquetes delimita primero el módulo del sistema al que pertenece el requerimiento (organización); (2) el Diagrama de Casos de Uso define, dentro de ese módulo, QUÉ hace el sistema para el actor (función); (3) el Diagrama de Clases identifica, a partir del caso de uso, los objetos del dominio y sus relaciones estáticas (estructura); (4) el Diagrama de Secuencia detalla CÓMO interactúan esas clases en el tiempo para resolver el escenario (comportamiento interno); (5) el Diagrama de Actividades complementa la secuencia con el flujo de proceso o negocio y sus decisiones o excepciones (comportamiento de proceso); y (6) el Diagrama de Entidad-Relación (lógico) cierra la cadena derivando el modelo de datos persistente —las colecciones de MongoDB documentadas en el SAD, §10.1— a partir de las clases de dominio ya identificadas. Aplicar el mismo orden en los 12 requerimientos permite comparar, RF a RF, en qué eslabón de esa cadena existe o no evidencia verificable en el código, en línea con el criterio de evidencia usado en la sección 3.</w:t>
+      </w:r>
+    </w:p>
+    <w:p>
+      <w:r>
+        <w:t>Al construir la fila de Entidad-Relación para RF-002 se detectó una segunda brecha, adicional a las ya documentadas en la sección 3: el SAD (FD04, §10.1) nombra las colecciones de este requerimiento "symptom_records" y "ai_predictions", pero los modelos Mongoose reales (backend/src/models/SymptomReport.js y backend/src/models/AIAnalysis.ts) no fijan un nombre explícito de colección, por lo que Mongoose genera por defecto "symptomreports" y "aianalyses". Es una brecha de nomenclatura entre el diseño documentado y la implementación real, no un error de la matriz: ambos nombres identifican las mismas dos entidades (SYMPTOM_REPORTS y AI_ANALYSES) del diagrama de la sección 5, y queda registrada explícitamente en la fila de Entidad-Relación de RF-002 de la matriz adjunta.</w:t>
       </w:r>
     </w:p>
     <w:p>
@@ -13513,7 +13567,7 @@
         <w:spacing w:after="80"/>
       </w:pPr>
       <w:r>
-        <w:t xml:space="preserve">De los 12 RF documentados, ocho (RF-001, RF-002, RF-003, RF-004, RF-006, RF-008, RF-009, RF-010) muestran trazabilidad completa y verificable entre el SRS (FD03), el SAD (FD04) y el código fuente real del proyecto, reconstruida en seis capas: ruta, validación, controlador, servicio, modelo/BD y frontend.</w:t>
+        <w:t>De los 12 RF documentados, los doce (RF-001 a RF-012) muestran trazabilidad completa y verificable entre el SRS (FD03), el SAD (FD04) y el código fuente real del proyecto, reconstruida en seis capas: ruta, validación, controlador, servicio, modelo/BD y frontend.</w:t>
       </w:r>
     </w:p>
     <w:p>
@@ -13552,7 +13606,7 @@
         <w:spacing w:after="80"/>
       </w:pPr>
       <w:r>
-        <w:t xml:space="preserve">Cada uno de los ocho requerimientos con implementación completa puede ejecutarse y explicarse de forma independiente usando solo sus propios componentes, con un comando curl verificable (sección 3), lo que facilita una demostración clara y modular para un evaluador que conoce el proyecto por primera vez.</w:t>
+        <w:t>Cada uno de los doce requerimientos puede ejecutarse y explicarse de forma independiente usando solo sus propios componentes, con un comando curl verificable (sección 3), lo que facilita una demostración clara y modular para un evaluador que conoce el proyecto por primera vez.</w:t>
       </w:r>
     </w:p>
     <w:p>
@@ -13578,7 +13632,23 @@
         <w:spacing w:after="80"/>
       </w:pPr>
       <w:r>
-        <w:t xml:space="preserve">Tres requerimientos presentan implementación parcial, con una parte de su flujo funcionando en código pero desconectada del camino real de producción: RF-005 (el motor de validación clínica MedicalValidationRules existe y es correcto, pero solo se ejecuta en el flujo de entrenamiento offline, nunca en el endpoint /v1/ml-analyze que atiende al paciente) y RF-007 (el monitoreo de señales vitales en tiempo real es real y funcional, pero no existe ningún endpoint para revisar, aprobar, rechazar o firmar una predicción, tal como exige el SRS).</w:t>
+        <w:t>RF-012 (Geolocalización de centros de salud) pasó de tener únicamente la captura y validación de ubicación (reutilizada de RF-004) a contar con búsqueda geoespacial de centros de salud: se corrigió el defecto de contrato de datos entre el formulario móvil de emergencia (emergencyService.ts, emergency-view.tsx) y el backend (emergencyRoutes.ts, emergencyService.ts), y se agregó el modelo HealthCenter.ts (índice 2dsphere), el servicio healthCenterService.ts y el endpoint GET /api/v1/health-centers/nearby, expuestos en la app móvil mediante una nueva sección “Centros de salud cercanos”.</w:t>
+      </w:r>
+    </w:p>
+    <w:p>
+      <w:pPr>
+        <w:pStyle w:val="ListParagraph"/>
+      </w:pPr>
+      <w:r>
+        <w:t>RF-005 (Validación de coherencia médica) pasó de tener su motor de reglas aislado en el script de entrenamiento a ejecutarse en cada predicción real: MedicalValidationRules se extrajo a services/medical_validation_rules.py y api/routes/symptom_ml_analyzer.py la invoca mediante _apply_medical_validation() en las tres rutas de predicción del endpoint /v1/ml-analyze (ensemble, fallback SHAP y fallback por patrones), exponiendo is_clinically_coherent y coherence_warnings en la respuesta al paciente.</w:t>
+      </w:r>
+    </w:p>
+    <w:p>
+      <w:pPr>
+        <w:pStyle w:val="ListParagraph"/>
+      </w:pPr>
+      <w:r>
+        <w:t>RF-007 (Panel del doctor) pasó de solo permitir el monitoreo de señales vitales en tiempo real a cerrar también el flujo de revisión médica exigido por el SRS: backend/src/models/AIAnalysis.ts añade un subdocumento review con firma electrónica y los métodos approve()/reject()/adjust(); backend/src/services/aiAnalysisReviewService.ts expone reviewPrediction() con validación del médico revisor y notificación al paciente; backend/src/routes/aiAnalysisReviewRoutes.ts expone GET /pending, GET /:id y POST /:id/review; y backend/src/controllers/symptomAnalyzerController.ts ahora persiste cada predicción real de /v1/ml-analyze como un documento AIAnalysis, corrigiendo la brecha adicional (no documentada explícitamente en la versión anterior) de que ninguna predicción real llegaba nunca a persistirse.</w:t>
       </w:r>
     </w:p>
     <w:p>
@@ -13591,20 +13661,7 @@
         <w:spacing w:after="80"/>
       </w:pPr>
       <w:r>
-        <w:t xml:space="preserve">La revisión de código para RF-012 (Geolocalización de centros de salud) reveló un hallazgo de auditoría concreto y accionable: la pantalla móvil de reporte manual de emergencia envía el campo type, mientras que el backend exige y valida el campo emergencyType, por lo que ese flujo específico devuelve 400 Bad Request tal como está el código hoy. Adicionalmente, no existe en el repositorio ninguna funcionalidad de búsqueda de centros de salud cercanos, pese a que la ubicación del paciente sí se captura y valida correctamente (reutilizando el mismo validador que RF-004).</w:t>
-      </w:r>
-    </w:p>
-    <w:p>
-      <w:pPr>
-        <w:pStyle w:val="ListParagraph"/>
-        <w:numPr>
-          <w:ilvl w:val="0"/>
-          <w:numId w:val="2"/>
-        </w:numPr>
-        <w:spacing w:after="80"/>
-      </w:pPr>
-      <w:r>
-        <w:t xml:space="preserve">RF-011 (Módulo educativo) no tiene ninguna implementación verificable: una búsqueda de los términos "educational", "educativo" y "educacion" en la totalidad del código de backend, web y mobile no arrojó ningún resultado. El requerimiento existe únicamente como diagramas UML de análisis y diseño (Figuras 101-110 del SAD).</w:t>
+        <w:t>RF-011 (Módulo educativo) pasó de no tener implementación verificable a contar con trazabilidad completa: el modelo EducationalContent (con findRelevantFor para filtrar por perfil/historial), el servicio educationalContentService (personalización y registro de consultas), las rutas REST bajo /api/v1/educational-content y las pantallas de paciente y administración en el frontend siguen la arquitectura propuesta en las Figuras 106-110 del SAD (§6.13).</w:t>
       </w:r>
     </w:p>
     <w:sectPr>

</xml_diff>